<commit_message>
Extend program catalog from US Utility Customer Programs Reference; correct DPP (Dynamic Peak Pricing) vs DPA (payment plan) naming in TDD and SDD
Co-Authored-By: Claude Fable 5 <noreply@anthropic.com>
</commit_message>
<xml_diff>
--- a/Enrollment Center/Enrollment Center - SAP Service Cloud V2 Solution Design v2.0.docx
+++ b/Enrollment Center/Enrollment Center - SAP Service Cloud V2 Solution Design v2.0.docx
@@ -7985,7 +7985,7 @@
               <w:rPr>
                 <w:sz w:val="19"/>
               </w:rPr>
-              <w:t>Peak-Time Rebate (PTR), Critical Peak Pricing (CPP), time-of-use rates</w:t>
+              <w:t>Peak-Time Rebate (PTR), Critical Peak Pricing (CPP), Dynamic Peak Pricing (DPP), time-of-use rates, EV managed charging, green power / community solar options</w:t>
             </w:r>
           </w:p>
         </w:tc>
@@ -8031,7 +8031,7 @@
               <w:rPr>
                 <w:sz w:val="19"/>
               </w:rPr>
-              <w:t>Deferred Payment Plan (DPP), budget billing, PrePay</w:t>
+              <w:t>Deferred Payment Arrangement (DPA), budget billing, PrePay, AutoPay, payment extension, arrearage management (AMP)</w:t>
             </w:r>
           </w:p>
         </w:tc>
@@ -8076,7 +8076,7 @@
               <w:rPr>
                 <w:sz w:val="19"/>
               </w:rPr>
-              <w:t>Customer Selects Due Date (CSDD), eBill / paperless billing</w:t>
+              <w:t>Customer Selects Due Date (CSDD), eBill / paperless billing, summary/consolidated billing, usage and high-bill alerts</w:t>
             </w:r>
           </w:p>
         </w:tc>
@@ -8167,7 +8167,7 @@
               <w:rPr>
                 <w:sz w:val="19"/>
               </w:rPr>
-              <w:t>Low-income assistance (DLA-type), medical alert</w:t>
+              <w:t>Low-income assistance (CARE/FERA, LIHEAP, PIPP), medical alert, third-party bill notification</w:t>
             </w:r>
           </w:p>
         </w:tc>
@@ -14112,7 +14112,7 @@
         <w:pStyle w:val="ListBullet"/>
       </w:pPr>
       <w:r>
-        <w:t>Program list for Release 1 to be confirmed (proposed: DPP, PTR, CPP, CSDD, PrePay based on legacy scope); each requires a per-program functional specification (capture form, rules, fulfillment recipe).</w:t>
+        <w:t>Program list for Release 1 to be confirmed (proposed: DPP (Dynamic Peak Pricing), DPA, PTR, CPP, CSDD, PrePay based on legacy scope; extended catalog per the U.S. Utility Customer Programs Reference (Aug 2026). Note: in the legacy source, 'DPP' denotes Dynamic Peak Pricing (a rate program fulfilled by product change); the installment payment plan is designated DPA); each requires a per-program functional specification (capture form, rules, fulfillment recipe).</w:t>
       </w:r>
     </w:p>
     <w:p>

</xml_diff>

<commit_message>
Add UI technology decision: Appendix A in Solution Design + detailed weighted evaluation document (BTP vs RAP-on-S/4 vs Web Dynpro)
Co-Authored-By: Claude Fable 5 <noreply@anthropic.com>
</commit_message>
<xml_diff>
--- a/Enrollment Center/Enrollment Center - SAP Service Cloud V2 Solution Design v2.0.docx
+++ b/Enrollment Center/Enrollment Center - SAP Service Cloud V2 Solution Design v2.0.docx
@@ -14212,6 +14212,264 @@
       </w:pPr>
       <w:r>
         <w:t>Build in two increments: Increment 1 — Enrollment Center shell, context load, eligibility, one program end-to-end (recommended: CSDD, simplest recipe); Increment 2 — remaining programs, de-enrollment, exception workflow, supervisor cockpit.</w:t>
+      </w:r>
+    </w:p>
+    <w:p>
+      <w:r>
+        <w:br w:type="page"/>
+      </w:r>
+    </w:p>
+    <w:p>
+      <w:pPr>
+        <w:pStyle w:val="Heading1"/>
+      </w:pPr>
+      <w:r>
+        <w:t>Appendix A — UI Technology Options Considered</w:t>
+      </w:r>
+    </w:p>
+    <w:p>
+      <w:pPr>
+        <w:spacing w:after="120"/>
+      </w:pPr>
+      <w:r>
+        <w:rPr>
+          <w:rFonts w:ascii="Arial" w:hAnsi="Arial"/>
+          <w:b w:val="0"/>
+          <w:sz w:val="21"/>
+        </w:rPr>
+        <w:t>Three UI technology options were evaluated for the Enrollment Center application. Note that 'Fiori' is a design system, not a hosting decision: the recommended option delivers a Fiori-design application (SAPUI5, Horizon theme) hosted on SAP BTP. The full weighted evaluation is documented in 'Enrollment Center – UI Technology Evaluation v1.0'.</w:t>
+      </w:r>
+    </w:p>
+    <w:tbl>
+      <w:tblPr>
+        <w:tblStyle w:val="TableGrid"/>
+        <w:tblW w:type="auto" w:w="0"/>
+        <w:jc w:val="center"/>
+        <w:tblLayout w:type="fixed"/>
+        <w:tblLook w:firstColumn="1" w:firstRow="1" w:lastColumn="0" w:lastRow="0" w:noHBand="0" w:noVBand="1" w:val="04A0"/>
+      </w:tblPr>
+      <w:tblGrid>
+        <w:gridCol w:w="2880"/>
+        <w:gridCol w:w="2880"/>
+        <w:gridCol w:w="2880"/>
+      </w:tblGrid>
+      <w:tr>
+        <w:tc>
+          <w:tcPr>
+            <w:tcW w:type="dxa" w:w="2016"/>
+            <w:shd w:val="clear" w:fill="1F4E79"/>
+          </w:tcPr>
+          <w:p>
+            <w:r/>
+            <w:r>
+              <w:rPr>
+                <w:rFonts w:ascii="Arial" w:hAnsi="Arial"/>
+                <w:b/>
+                <w:color w:val="FFFFFF"/>
+                <w:sz w:val="17"/>
+              </w:rPr>
+              <w:t>Option</w:t>
+            </w:r>
+          </w:p>
+        </w:tc>
+        <w:tc>
+          <w:tcPr>
+            <w:tcW w:type="dxa" w:w="3456"/>
+            <w:shd w:val="clear" w:fill="1F4E79"/>
+          </w:tcPr>
+          <w:p>
+            <w:r/>
+            <w:r>
+              <w:rPr>
+                <w:rFonts w:ascii="Arial" w:hAnsi="Arial"/>
+                <w:b/>
+                <w:color w:val="FFFFFF"/>
+                <w:sz w:val="17"/>
+              </w:rPr>
+              <w:t>Description</w:t>
+            </w:r>
+          </w:p>
+        </w:tc>
+        <w:tc>
+          <w:tcPr>
+            <w:tcW w:type="dxa" w:w="3888"/>
+            <w:shd w:val="clear" w:fill="1F4E79"/>
+          </w:tcPr>
+          <w:p>
+            <w:r/>
+            <w:r>
+              <w:rPr>
+                <w:rFonts w:ascii="Arial" w:hAnsi="Arial"/>
+                <w:b/>
+                <w:color w:val="FFFFFF"/>
+                <w:sz w:val="17"/>
+              </w:rPr>
+              <w:t>Assessment</w:t>
+            </w:r>
+          </w:p>
+        </w:tc>
+      </w:tr>
+      <w:tr>
+        <w:tc>
+          <w:tcPr>
+            <w:tcW w:type="dxa" w:w="2016"/>
+          </w:tcPr>
+          <w:p>
+            <w:r/>
+            <w:r>
+              <w:rPr>
+                <w:rFonts w:ascii="Arial" w:hAnsi="Arial"/>
+                <w:sz w:val="17"/>
+              </w:rPr>
+              <w:t>A. SAP BTP side-by-side (RECOMMENDED)</w:t>
+            </w:r>
+          </w:p>
+        </w:tc>
+        <w:tc>
+          <w:tcPr>
+            <w:tcW w:type="dxa" w:w="3456"/>
+          </w:tcPr>
+          <w:p>
+            <w:r/>
+            <w:r>
+              <w:rPr>
+                <w:rFonts w:ascii="Arial" w:hAnsi="Arial"/>
+                <w:sz w:val="17"/>
+              </w:rPr>
+              <w:t>SAPUI5/Fiori Elements (TypeScript, Horizon) on HTML5 Application Repository; CAP services on Cloud Foundry; embedded in SC V2 as work-center mashup and Move-In step</w:t>
+            </w:r>
+          </w:p>
+        </w:tc>
+        <w:tc>
+          <w:tcPr>
+            <w:tcW w:type="dxa" w:w="3888"/>
+          </w:tcPr>
+          <w:p>
+            <w:r/>
+            <w:r>
+              <w:rPr>
+                <w:rFonts w:ascii="Arial" w:hAnsi="Arial"/>
+                <w:sz w:val="17"/>
+              </w:rPr>
+              <w:t>Selected. Clean core; native SC V2 embedding with IAS SSO; independent release cycle; the orchestration (eventing, workflow, deferred fulfillment, audit) requires BTP services regardless; API layer reusable for self-service/IVR/DER channels. Carries BTP subscription cost (Config Guide Section 2.2) — justified by the SC V2 strategy.</w:t>
+            </w:r>
+          </w:p>
+        </w:tc>
+      </w:tr>
+      <w:tr>
+        <w:tc>
+          <w:tcPr>
+            <w:tcW w:type="dxa" w:w="2016"/>
+            <w:shd w:val="clear" w:fill="DEEAF6"/>
+          </w:tcPr>
+          <w:p>
+            <w:r/>
+            <w:r>
+              <w:rPr>
+                <w:rFonts w:ascii="Arial" w:hAnsi="Arial"/>
+                <w:sz w:val="17"/>
+              </w:rPr>
+              <w:t>B. Embedded Fiori (RAP) on S/4HANA</w:t>
+            </w:r>
+          </w:p>
+        </w:tc>
+        <w:tc>
+          <w:tcPr>
+            <w:tcW w:type="dxa" w:w="3456"/>
+            <w:shd w:val="clear" w:fill="DEEAF6"/>
+          </w:tcPr>
+          <w:p>
+            <w:r/>
+            <w:r>
+              <w:rPr>
+                <w:rFonts w:ascii="Arial" w:hAnsi="Arial"/>
+                <w:sz w:val="17"/>
+              </w:rPr>
+              <w:t>Fiori/UI5 app developed on the S/4HANA ABAP stack (RAP), surfaced to agents from the S/4 gateway</w:t>
+            </w:r>
+          </w:p>
+        </w:tc>
+        <w:tc>
+          <w:tcPr>
+            <w:tcW w:type="dxa" w:w="3888"/>
+            <w:shd w:val="clear" w:fill="DEEAF6"/>
+          </w:tcPr>
+          <w:p>
+            <w:r/>
+            <w:r>
+              <w:rPr>
+                <w:rFonts w:ascii="Arial" w:hAnsi="Arial"/>
+                <w:sz w:val="17"/>
+              </w:rPr>
+              <w:t>Fallback only (client without BTP). Agents work in SC V2, so browsers would need routes to the S/4HANA gateway; custom UI enters the digital core; UI releases coupled to S/4HANA maintenance; BTP still needed for workflow/eventing halves; no channel reuse. Reduced-scope variant documented in the evaluation.</w:t>
+            </w:r>
+          </w:p>
+        </w:tc>
+      </w:tr>
+      <w:tr>
+        <w:tc>
+          <w:tcPr>
+            <w:tcW w:type="dxa" w:w="2016"/>
+          </w:tcPr>
+          <w:p>
+            <w:r/>
+            <w:r>
+              <w:rPr>
+                <w:rFonts w:ascii="Arial" w:hAnsi="Arial"/>
+                <w:sz w:val="17"/>
+              </w:rPr>
+              <w:t>C. ABAP Web Dynpro</w:t>
+            </w:r>
+          </w:p>
+        </w:tc>
+        <w:tc>
+          <w:tcPr>
+            <w:tcW w:type="dxa" w:w="3456"/>
+          </w:tcPr>
+          <w:p>
+            <w:r/>
+            <w:r>
+              <w:rPr>
+                <w:rFonts w:ascii="Arial" w:hAnsi="Arial"/>
+                <w:sz w:val="17"/>
+              </w:rPr>
+              <w:t>Classic Web Dynpro ABAP application in S/4HANA</w:t>
+            </w:r>
+          </w:p>
+        </w:tc>
+        <w:tc>
+          <w:tcPr>
+            <w:tcW w:type="dxa" w:w="3888"/>
+          </w:tcPr>
+          <w:p>
+            <w:r/>
+            <w:r>
+              <w:rPr>
+                <w:rFonts w:ascii="Arial" w:hAnsi="Arial"/>
+                <w:sz w:val="17"/>
+              </w:rPr>
+              <w:t>Rejected. Maintenance-mode technology outside SAP's strategic direction; no SC V2 embedding or Horizon theming; desktop-only UX; custom code in the core; unsuitable for any new build.</w:t>
+            </w:r>
+          </w:p>
+        </w:tc>
+      </w:tr>
+    </w:tbl>
+    <w:p>
+      <w:pPr>
+        <w:spacing w:after="40"/>
+      </w:pPr>
+    </w:p>
+    <w:p>
+      <w:pPr>
+        <w:spacing w:after="120"/>
+      </w:pPr>
+      <w:r>
+        <w:rPr>
+          <w:rFonts w:ascii="Arial" w:hAnsi="Arial"/>
+          <w:b w:val="0"/>
+          <w:sz w:val="21"/>
+        </w:rPr>
+        <w:t>Decision criteria (weighted in the evaluation document): SC V2 embedding quality, clean-core compliance, fit for the orchestration architecture, channel reuse, release independence, SAP strategic alignment, skills availability, total cost, performance and security. Option A scores highest on all criteria except subscription cost. This appendix records the decision for architecture review; the detailed scoring, cost discussion and risk register are maintained in the evaluation document.</w:t>
       </w:r>
     </w:p>
     <w:sectPr>

</xml_diff>

<commit_message>
Incorporate AI/ML scope: AI-ML Roadmap v1.0 (7 use cases, governance, phasing), SDD Appendix B, deck AI slide, demo AI features generator
Co-Authored-By: Claude Fable 5 <noreply@anthropic.com>
</commit_message>
<xml_diff>
--- a/Enrollment Center/Enrollment Center - SAP Service Cloud V2 Solution Design v2.0.docx
+++ b/Enrollment Center/Enrollment Center - SAP Service Cloud V2 Solution Design v2.0.docx
@@ -14482,6 +14482,405 @@
           <w:sz w:val="21"/>
         </w:rPr>
         <w:t>Decision criteria (weighted in the evaluation document): SC V2 embedding quality, clean-core compliance, fit for the orchestration architecture, channel reuse, release independence, SAP strategic alignment, skills availability, total cost, performance and security. Option A scores highest on all criteria except subscription cost. This appendix records the decision for architecture review; the detailed scoring, cost discussion and risk register are maintained in the evaluation document.</w:t>
+      </w:r>
+    </w:p>
+    <w:p>
+      <w:r>
+        <w:br w:type="page"/>
+      </w:r>
+    </w:p>
+    <w:p>
+      <w:pPr>
+        <w:pStyle w:val="Heading1"/>
+      </w:pPr>
+      <w:r>
+        <w:t>Appendix B — AI/ML Scope</w:t>
+      </w:r>
+    </w:p>
+    <w:p>
+      <w:pPr>
+        <w:spacing w:after="120"/>
+      </w:pPr>
+      <w:r>
+        <w:rPr>
+          <w:rFonts w:ascii="Arial" w:hAnsi="Arial"/>
+          <w:b w:val="0"/>
+          <w:sz w:val="21"/>
+        </w:rPr>
+        <w:t>The solution is extended by an AI/ML layer governed by one principle: ML recommends — BRFplus decides. Hard eligibility, warnings and pre-active behavior remain deterministic decision-table outcomes; AI operates above that line with the agent in the loop. Full detail (use cases AI-1…AI-7, technology mapping, phasing, governance) is maintained in 'Enrollment Center – AI/ML Roadmap v1.0'.</w:t>
+      </w:r>
+    </w:p>
+    <w:tbl>
+      <w:tblPr>
+        <w:tblStyle w:val="TableGrid"/>
+        <w:tblW w:type="auto" w:w="0"/>
+        <w:jc w:val="center"/>
+        <w:tblLook w:firstColumn="1" w:firstRow="1" w:lastColumn="0" w:lastRow="0" w:noHBand="0" w:noVBand="1" w:val="04A0"/>
+      </w:tblPr>
+      <w:tblGrid>
+        <w:gridCol w:w="2880"/>
+        <w:gridCol w:w="2880"/>
+        <w:gridCol w:w="2880"/>
+      </w:tblGrid>
+      <w:tr>
+        <w:tc>
+          <w:tcPr>
+            <w:tcW w:type="dxa" w:w="2448"/>
+            <w:shd w:val="clear" w:fill="1F4E79"/>
+          </w:tcPr>
+          <w:p>
+            <w:r/>
+            <w:r>
+              <w:rPr>
+                <w:rFonts w:ascii="Arial" w:hAnsi="Arial"/>
+                <w:b/>
+                <w:color w:val="FFFFFF"/>
+                <w:sz w:val="18"/>
+              </w:rPr>
+              <w:t>Use Case</w:t>
+            </w:r>
+          </w:p>
+        </w:tc>
+        <w:tc>
+          <w:tcPr>
+            <w:tcW w:type="dxa" w:w="5184"/>
+            <w:shd w:val="clear" w:fill="1F4E79"/>
+          </w:tcPr>
+          <w:p>
+            <w:r/>
+            <w:r>
+              <w:rPr>
+                <w:rFonts w:ascii="Arial" w:hAnsi="Arial"/>
+                <w:b/>
+                <w:color w:val="FFFFFF"/>
+                <w:sz w:val="18"/>
+              </w:rPr>
+              <w:t>Summary</w:t>
+            </w:r>
+          </w:p>
+        </w:tc>
+        <w:tc>
+          <w:tcPr>
+            <w:tcW w:type="dxa" w:w="1728"/>
+            <w:shd w:val="clear" w:fill="1F4E79"/>
+          </w:tcPr>
+          <w:p>
+            <w:r/>
+            <w:r>
+              <w:rPr>
+                <w:rFonts w:ascii="Arial" w:hAnsi="Arial"/>
+                <w:b/>
+                <w:color w:val="FFFFFF"/>
+                <w:sz w:val="18"/>
+              </w:rPr>
+              <w:t>Phase</w:t>
+            </w:r>
+          </w:p>
+        </w:tc>
+      </w:tr>
+      <w:tr>
+        <w:tc>
+          <w:tcPr>
+            <w:tcW w:type="dxa" w:w="2448"/>
+          </w:tcPr>
+          <w:p>
+            <w:r/>
+            <w:r>
+              <w:rPr>
+                <w:rFonts w:ascii="Arial" w:hAnsi="Arial"/>
+                <w:sz w:val="18"/>
+              </w:rPr>
+              <w:t>AI-1 Next-best-program recommendation</w:t>
+            </w:r>
+          </w:p>
+        </w:tc>
+        <w:tc>
+          <w:tcPr>
+            <w:tcW w:type="dxa" w:w="5184"/>
+          </w:tcPr>
+          <w:p>
+            <w:r/>
+            <w:r>
+              <w:rPr>
+                <w:rFonts w:ascii="Arial" w:hAnsi="Arial"/>
+                <w:sz w:val="18"/>
+              </w:rPr>
+              <w:t>Propensity ranking of Available Programs with reasons (EC-10 scoring API; HANA Cloud PAL)</w:t>
+            </w:r>
+          </w:p>
+        </w:tc>
+        <w:tc>
+          <w:tcPr>
+            <w:tcW w:type="dxa" w:w="1728"/>
+          </w:tcPr>
+          <w:p>
+            <w:r/>
+            <w:r>
+              <w:rPr>
+                <w:rFonts w:ascii="Arial" w:hAnsi="Arial"/>
+                <w:sz w:val="18"/>
+              </w:rPr>
+              <w:t>Phase 1</w:t>
+            </w:r>
+          </w:p>
+        </w:tc>
+      </w:tr>
+      <w:tr>
+        <w:tc>
+          <w:tcPr>
+            <w:tcW w:type="dxa" w:w="2448"/>
+            <w:shd w:val="clear" w:fill="DEEAF6"/>
+          </w:tcPr>
+          <w:p>
+            <w:r/>
+            <w:r>
+              <w:rPr>
+                <w:rFonts w:ascii="Arial" w:hAnsi="Arial"/>
+                <w:sz w:val="18"/>
+              </w:rPr>
+              <w:t>AI-2 Grounded agent copilot</w:t>
+            </w:r>
+          </w:p>
+        </w:tc>
+        <w:tc>
+          <w:tcPr>
+            <w:tcW w:type="dxa" w:w="5184"/>
+            <w:shd w:val="clear" w:fill="DEEAF6"/>
+          </w:tcPr>
+          <w:p>
+            <w:r/>
+            <w:r>
+              <w:rPr>
+                <w:rFonts w:ascii="Arial" w:hAnsi="Arial"/>
+                <w:sz w:val="18"/>
+              </w:rPr>
+              <w:t>Plain-language program explanations and eligibility remediation, grounded on the program catalog (Generative AI Hub / Joule Studio; CX AI Toolkit)</w:t>
+            </w:r>
+          </w:p>
+        </w:tc>
+        <w:tc>
+          <w:tcPr>
+            <w:tcW w:type="dxa" w:w="1728"/>
+            <w:shd w:val="clear" w:fill="DEEAF6"/>
+          </w:tcPr>
+          <w:p>
+            <w:r/>
+            <w:r>
+              <w:rPr>
+                <w:rFonts w:ascii="Arial" w:hAnsi="Arial"/>
+                <w:sz w:val="18"/>
+              </w:rPr>
+              <w:t>Phase 1</w:t>
+            </w:r>
+          </w:p>
+        </w:tc>
+      </w:tr>
+      <w:tr>
+        <w:tc>
+          <w:tcPr>
+            <w:tcW w:type="dxa" w:w="2448"/>
+          </w:tcPr>
+          <w:p>
+            <w:r/>
+            <w:r>
+              <w:rPr>
+                <w:rFonts w:ascii="Arial" w:hAnsi="Arial"/>
+                <w:sz w:val="18"/>
+              </w:rPr>
+              <w:t>AI-3 Bill-impact simulation</w:t>
+            </w:r>
+          </w:p>
+        </w:tc>
+        <w:tc>
+          <w:tcPr>
+            <w:tcW w:type="dxa" w:w="5184"/>
+          </w:tcPr>
+          <w:p>
+            <w:r/>
+            <w:r>
+              <w:rPr>
+                <w:rFonts w:ascii="Arial" w:hAnsi="Arial"/>
+                <w:sz w:val="18"/>
+              </w:rPr>
+              <w:t>Recompute interval data under the target rate before enrolling — recommend only when beneficial</w:t>
+            </w:r>
+          </w:p>
+        </w:tc>
+        <w:tc>
+          <w:tcPr>
+            <w:tcW w:type="dxa" w:w="1728"/>
+          </w:tcPr>
+          <w:p>
+            <w:r/>
+            <w:r>
+              <w:rPr>
+                <w:rFonts w:ascii="Arial" w:hAnsi="Arial"/>
+                <w:sz w:val="18"/>
+              </w:rPr>
+              <w:t>Phase 2</w:t>
+            </w:r>
+          </w:p>
+        </w:tc>
+      </w:tr>
+      <w:tr>
+        <w:tc>
+          <w:tcPr>
+            <w:tcW w:type="dxa" w:w="2448"/>
+            <w:shd w:val="clear" w:fill="DEEAF6"/>
+          </w:tcPr>
+          <w:p>
+            <w:r/>
+            <w:r>
+              <w:rPr>
+                <w:rFonts w:ascii="Arial" w:hAnsi="Arial"/>
+                <w:sz w:val="18"/>
+              </w:rPr>
+              <w:t>AI-4 Payment-plan default risk</w:t>
+            </w:r>
+          </w:p>
+        </w:tc>
+        <w:tc>
+          <w:tcPr>
+            <w:tcW w:type="dxa" w:w="5184"/>
+            <w:shd w:val="clear" w:fill="DEEAF6"/>
+          </w:tcPr>
+          <w:p>
+            <w:r/>
+            <w:r>
+              <w:rPr>
+                <w:rFonts w:ascii="Arial" w:hAnsi="Arial"/>
+                <w:sz w:val="18"/>
+              </w:rPr>
+              <w:t>Predict DPA/AMP breakage; proactive outreach</w:t>
+            </w:r>
+          </w:p>
+        </w:tc>
+        <w:tc>
+          <w:tcPr>
+            <w:tcW w:type="dxa" w:w="1728"/>
+            <w:shd w:val="clear" w:fill="DEEAF6"/>
+          </w:tcPr>
+          <w:p>
+            <w:r/>
+            <w:r>
+              <w:rPr>
+                <w:rFonts w:ascii="Arial" w:hAnsi="Arial"/>
+                <w:sz w:val="18"/>
+              </w:rPr>
+              <w:t>Phase 2</w:t>
+            </w:r>
+          </w:p>
+        </w:tc>
+      </w:tr>
+      <w:tr>
+        <w:tc>
+          <w:tcPr>
+            <w:tcW w:type="dxa" w:w="2448"/>
+          </w:tcPr>
+          <w:p>
+            <w:r/>
+            <w:r>
+              <w:rPr>
+                <w:rFonts w:ascii="Arial" w:hAnsi="Arial"/>
+                <w:sz w:val="18"/>
+              </w:rPr>
+              <w:t>AI-5 Assistance document intelligence</w:t>
+            </w:r>
+          </w:p>
+        </w:tc>
+        <w:tc>
+          <w:tcPr>
+            <w:tcW w:type="dxa" w:w="5184"/>
+          </w:tcPr>
+          <w:p>
+            <w:r/>
+            <w:r>
+              <w:rPr>
+                <w:rFonts w:ascii="Arial" w:hAnsi="Arial"/>
+                <w:sz w:val="18"/>
+              </w:rPr>
+              <w:t>Income-proof extraction (Document Information Extraction) for LIHEAP/PIPP/CARE</w:t>
+            </w:r>
+          </w:p>
+        </w:tc>
+        <w:tc>
+          <w:tcPr>
+            <w:tcW w:type="dxa" w:w="1728"/>
+          </w:tcPr>
+          <w:p>
+            <w:r/>
+            <w:r>
+              <w:rPr>
+                <w:rFonts w:ascii="Arial" w:hAnsi="Arial"/>
+                <w:sz w:val="18"/>
+              </w:rPr>
+              <w:t>Phase 2</w:t>
+            </w:r>
+          </w:p>
+        </w:tc>
+      </w:tr>
+      <w:tr>
+        <w:tc>
+          <w:tcPr>
+            <w:tcW w:type="dxa" w:w="2448"/>
+            <w:shd w:val="clear" w:fill="DEEAF6"/>
+          </w:tcPr>
+          <w:p>
+            <w:r/>
+            <w:r>
+              <w:rPr>
+                <w:rFonts w:ascii="Arial" w:hAnsi="Arial"/>
+                <w:sz w:val="18"/>
+              </w:rPr>
+              <w:t>AI-6 / AI-7</w:t>
+            </w:r>
+          </w:p>
+        </w:tc>
+        <w:tc>
+          <w:tcPr>
+            <w:tcW w:type="dxa" w:w="5184"/>
+            <w:shd w:val="clear" w:fill="DEEAF6"/>
+          </w:tcPr>
+          <w:p>
+            <w:r/>
+            <w:r>
+              <w:rPr>
+                <w:rFonts w:ascii="Arial" w:hAnsi="Arial"/>
+                <w:sz w:val="18"/>
+              </w:rPr>
+              <w:t>Exception triage learning; DER baseline &amp; fleet forecasting (DER platform side)</w:t>
+            </w:r>
+          </w:p>
+        </w:tc>
+        <w:tc>
+          <w:tcPr>
+            <w:tcW w:type="dxa" w:w="1728"/>
+            <w:shd w:val="clear" w:fill="DEEAF6"/>
+          </w:tcPr>
+          <w:p>
+            <w:r/>
+            <w:r>
+              <w:rPr>
+                <w:rFonts w:ascii="Arial" w:hAnsi="Arial"/>
+                <w:sz w:val="18"/>
+              </w:rPr>
+              <w:t>Phase 3</w:t>
+            </w:r>
+          </w:p>
+        </w:tc>
+      </w:tr>
+    </w:tbl>
+    <w:p>
+      <w:pPr>
+        <w:spacing w:after="120"/>
+      </w:pPr>
+      <w:r>
+        <w:rPr>
+          <w:rFonts w:ascii="Arial" w:hAnsi="Arial"/>
+          <w:b w:val="0"/>
+          <w:sz w:val="21"/>
+        </w:rPr>
+        <w:t>The interactive demo previews AI-1 and AI-2 (mock scores, grounded explanation composed from catalog and customer facts), clearly labeled as AI and outside the eligibility decision path.</w:t>
       </w:r>
     </w:p>
     <w:sectPr>

</xml_diff>